<commit_message>
Stable 3.0 Java "Cambios autocompletado y cambio plantilla checklist"
</commit_message>
<xml_diff>
--- a/backend/src/main/resources/plantillas/ActaDevolucion.docx
+++ b/backend/src/main/resources/plantillas/ActaDevolucion.docx
@@ -62,7 +62,7 @@
                 <v:shape id="_x0000_i1025" type="#_x0000_t75" style="width:114.6pt;height:33pt" o:ole="">
                   <v:imagedata r:id="rId11" o:title=""/>
                 </v:shape>
-                <o:OLEObject Type="Embed" ProgID="PBrush" ShapeID="_x0000_i1025" DrawAspect="Content" ObjectID="_1847248646" r:id="rId12"/>
+                <o:OLEObject Type="Embed" ProgID="PBrush" ShapeID="_x0000_i1025" DrawAspect="Content" ObjectID="_1847251292" r:id="rId12"/>
               </w:object>
             </w:r>
           </w:p>
@@ -2881,7 +2881,7 @@
     </w:p>
     <w:tbl>
       <w:tblPr>
-        <w:tblpPr w:leftFromText="141" w:rightFromText="141" w:vertAnchor="text" w:horzAnchor="page" w:tblpX="819" w:tblpY="47"/>
+        <w:tblpPr w:leftFromText="141" w:rightFromText="141" w:vertAnchor="text" w:horzAnchor="margin" w:tblpXSpec="right" w:tblpY="89"/>
         <w:tblW w:w="0" w:type="auto"/>
         <w:tblBorders>
           <w:top w:val="single" w:sz="4" w:space="0" w:color="auto"/>
@@ -2902,7 +2902,7 @@
       </w:tblGrid>
       <w:tr>
         <w:trPr>
-          <w:trHeight w:val="360"/>
+          <w:trHeight w:val="538"/>
         </w:trPr>
         <w:tc>
           <w:tcPr>
@@ -2914,141 +2914,36 @@
               <w:right w:val="single" w:sz="12" w:space="0" w:color="auto"/>
             </w:tcBorders>
             <w:shd w:val="clear" w:color="auto" w:fill="D9D9D9" w:themeFill="background1" w:themeFillShade="D9"/>
+            <w:vAlign w:val="center"/>
           </w:tcPr>
           <w:p>
             <w:pPr>
               <w:jc w:val="center"/>
+              <w:rPr>
+                <w:rFonts w:ascii="Arial Narrow" w:hAnsi="Arial Narrow" w:cs="Arial"/>
+                <w:b/>
+                <w:bCs/>
+                <w:sz w:val="22"/>
+                <w:szCs w:val="22"/>
+              </w:rPr>
             </w:pPr>
-            <w:r>
-              <w:rPr>
-                <w:rFonts w:ascii="Arial Narrow" w:hAnsi="Arial Narrow"/>
+            <w:bookmarkStart w:id="2" w:name="OLE_LINK28"/>
+            <w:r>
+              <w:rPr>
+                <w:rFonts w:ascii="Arial Narrow" w:hAnsi="Arial Narrow" w:cs="Arial"/>
                 <w:b/>
                 <w:bCs/>
-                <w:color w:val="000000"/>
-                <w:sz w:val="22"/>
-                <w:szCs w:val="22"/>
-              </w:rPr>
-              <w:t>Recepción</w:t>
-            </w:r>
-          </w:p>
-          <w:p>
-            <w:pPr>
-              <w:jc w:val="center"/>
-              <w:rPr>
-                <w:rFonts w:ascii="Arial Narrow" w:hAnsi="Arial Narrow" w:cs="Arial"/>
-                <w:b/>
-                <w:bCs/>
-                <w:sz w:val="22"/>
-                <w:szCs w:val="22"/>
-              </w:rPr>
-            </w:pPr>
-            <w:r>
-              <w:rPr>
-                <w:rFonts w:ascii="Arial Narrow" w:hAnsi="Arial Narrow"/>
-                <w:b/>
-                <w:bCs/>
-                <w:color w:val="000000"/>
-                <w:sz w:val="22"/>
-                <w:szCs w:val="22"/>
-              </w:rPr>
-              <w:t>(Dirección de Infraestructura)</w:t>
+                <w:sz w:val="22"/>
+                <w:szCs w:val="22"/>
+              </w:rPr>
+              <w:t>Entrega</w:t>
             </w:r>
           </w:p>
         </w:tc>
       </w:tr>
       <w:tr>
         <w:trPr>
-          <w:trHeight w:val="1698"/>
-        </w:trPr>
-        <w:tc>
-          <w:tcPr>
-            <w:tcW w:w="3189" w:type="dxa"/>
-            <w:tcBorders>
-              <w:top w:val="single" w:sz="12" w:space="0" w:color="auto"/>
-              <w:left w:val="single" w:sz="12" w:space="0" w:color="auto"/>
-              <w:bottom w:val="single" w:sz="12" w:space="0" w:color="auto"/>
-              <w:right w:val="single" w:sz="12" w:space="0" w:color="auto"/>
-            </w:tcBorders>
-            <w:vAlign w:val="center"/>
-          </w:tcPr>
-          <w:p>
-            <w:pPr>
-              <w:ind w:left="88"/>
-              <w:jc w:val="center"/>
-              <w:rPr>
-                <w:rFonts w:ascii="Arial Narrow" w:hAnsi="Arial Narrow" w:cs="Arial"/>
-                <w:sz w:val="22"/>
-                <w:szCs w:val="22"/>
-              </w:rPr>
-            </w:pPr>
-          </w:p>
-        </w:tc>
-      </w:tr>
-    </w:tbl>
-    <w:tbl>
-      <w:tblPr>
-        <w:tblpPr w:leftFromText="141" w:rightFromText="141" w:vertAnchor="text" w:horzAnchor="page" w:tblpX="7887" w:tblpY="27"/>
-        <w:tblW w:w="0" w:type="auto"/>
-        <w:tblBorders>
-          <w:top w:val="single" w:sz="4" w:space="0" w:color="auto"/>
-          <w:left w:val="single" w:sz="4" w:space="0" w:color="auto"/>
-          <w:bottom w:val="single" w:sz="4" w:space="0" w:color="auto"/>
-          <w:right w:val="single" w:sz="4" w:space="0" w:color="auto"/>
-          <w:insideH w:val="single" w:sz="4" w:space="0" w:color="auto"/>
-          <w:insideV w:val="single" w:sz="4" w:space="0" w:color="auto"/>
-        </w:tblBorders>
-        <w:tblCellMar>
-          <w:left w:w="70" w:type="dxa"/>
-          <w:right w:w="70" w:type="dxa"/>
-        </w:tblCellMar>
-        <w:tblLook w:val="0000" w:firstRow="0" w:lastRow="0" w:firstColumn="0" w:lastColumn="0" w:noHBand="0" w:noVBand="0"/>
-      </w:tblPr>
-      <w:tblGrid>
-        <w:gridCol w:w="3189"/>
-      </w:tblGrid>
-      <w:tr>
-        <w:trPr>
-          <w:trHeight w:val="360"/>
-        </w:trPr>
-        <w:tc>
-          <w:tcPr>
-            <w:tcW w:w="3189" w:type="dxa"/>
-            <w:tcBorders>
-              <w:top w:val="single" w:sz="12" w:space="0" w:color="auto"/>
-              <w:left w:val="single" w:sz="12" w:space="0" w:color="auto"/>
-              <w:bottom w:val="single" w:sz="12" w:space="0" w:color="auto"/>
-              <w:right w:val="single" w:sz="12" w:space="0" w:color="auto"/>
-            </w:tcBorders>
-            <w:shd w:val="clear" w:color="auto" w:fill="D9D9D9" w:themeFill="background1" w:themeFillShade="D9"/>
-          </w:tcPr>
-          <w:p>
-            <w:pPr>
-              <w:jc w:val="center"/>
-              <w:rPr>
-                <w:rFonts w:ascii="Arial Narrow" w:hAnsi="Arial Narrow" w:cs="Arial"/>
-                <w:b/>
-                <w:bCs/>
-                <w:sz w:val="22"/>
-                <w:szCs w:val="22"/>
-              </w:rPr>
-            </w:pPr>
-            <w:bookmarkStart w:id="2" w:name="OLE_LINK28"/>
-            <w:r>
-              <w:rPr>
-                <w:rFonts w:ascii="Arial Narrow" w:hAnsi="Arial Narrow" w:cs="Arial"/>
-                <w:b/>
-                <w:bCs/>
-                <w:sz w:val="22"/>
-                <w:szCs w:val="22"/>
-              </w:rPr>
-              <w:t>Entrega</w:t>
-            </w:r>
-          </w:p>
-        </w:tc>
-      </w:tr>
-      <w:tr>
-        <w:trPr>
-          <w:trHeight w:val="1280"/>
+          <w:trHeight w:val="1553"/>
         </w:trPr>
         <w:tc>
           <w:tcPr>
@@ -3103,7 +2998,16 @@
                 <w:sz w:val="22"/>
                 <w:szCs w:val="22"/>
               </w:rPr>
-              <w:t>Recibido por</w:t>
+              <w:t xml:space="preserve">Recibido </w:t>
+            </w:r>
+            <w:proofErr w:type="gramStart"/>
+            <w:r>
+              <w:rPr>
+                <w:rFonts w:ascii="Arial Narrow" w:hAnsi="Arial Narrow" w:cs="Arial"/>
+                <w:sz w:val="22"/>
+                <w:szCs w:val="22"/>
+              </w:rPr>
+              <w:t>por</w:t>
             </w:r>
             <w:r>
               <w:rPr>
@@ -3111,23 +3015,16 @@
                 <w:sz w:val="22"/>
                 <w:szCs w:val="22"/>
               </w:rPr>
-              <w:t>:</w:t>
-            </w:r>
+              <w:t>:{</w:t>
+            </w:r>
+            <w:proofErr w:type="gramEnd"/>
             <w:r>
               <w:rPr>
                 <w:rFonts w:ascii="Arial Narrow" w:hAnsi="Arial Narrow"/>
                 <w:sz w:val="22"/>
                 <w:szCs w:val="22"/>
               </w:rPr>
-              <w:t xml:space="preserve"> </w:t>
-            </w:r>
-            <w:r>
-              <w:rPr>
-                <w:rFonts w:ascii="Arial Narrow" w:hAnsi="Arial Narrow"/>
-                <w:sz w:val="22"/>
-                <w:szCs w:val="22"/>
-              </w:rPr>
-              <w:t>{{</w:t>
+              <w:t>{</w:t>
             </w:r>
             <w:proofErr w:type="spellStart"/>
             <w:r>
@@ -3216,7 +3113,227 @@
           </w:p>
         </w:tc>
       </w:tr>
-      <w:bookmarkEnd w:id="2"/>
+    </w:tbl>
+    <w:tbl>
+      <w:tblPr>
+        <w:tblpPr w:leftFromText="141" w:rightFromText="141" w:vertAnchor="text" w:horzAnchor="margin" w:tblpY="89"/>
+        <w:tblW w:w="0" w:type="auto"/>
+        <w:tblBorders>
+          <w:top w:val="single" w:sz="4" w:space="0" w:color="auto"/>
+          <w:left w:val="single" w:sz="4" w:space="0" w:color="auto"/>
+          <w:bottom w:val="single" w:sz="4" w:space="0" w:color="auto"/>
+          <w:right w:val="single" w:sz="4" w:space="0" w:color="auto"/>
+          <w:insideH w:val="single" w:sz="4" w:space="0" w:color="auto"/>
+          <w:insideV w:val="single" w:sz="4" w:space="0" w:color="auto"/>
+        </w:tblBorders>
+        <w:tblCellMar>
+          <w:left w:w="70" w:type="dxa"/>
+          <w:right w:w="70" w:type="dxa"/>
+        </w:tblCellMar>
+        <w:tblLook w:val="0000" w:firstRow="0" w:lastRow="0" w:firstColumn="0" w:lastColumn="0" w:noHBand="0" w:noVBand="0"/>
+      </w:tblPr>
+      <w:tblGrid>
+        <w:gridCol w:w="3189"/>
+      </w:tblGrid>
+      <w:tr>
+        <w:trPr>
+          <w:trHeight w:val="396"/>
+        </w:trPr>
+        <w:tc>
+          <w:tcPr>
+            <w:tcW w:w="3189" w:type="dxa"/>
+            <w:tcBorders>
+              <w:top w:val="single" w:sz="12" w:space="0" w:color="auto"/>
+              <w:left w:val="single" w:sz="12" w:space="0" w:color="auto"/>
+              <w:bottom w:val="single" w:sz="12" w:space="0" w:color="auto"/>
+              <w:right w:val="single" w:sz="12" w:space="0" w:color="auto"/>
+            </w:tcBorders>
+            <w:shd w:val="clear" w:color="auto" w:fill="D9D9D9" w:themeFill="background1" w:themeFillShade="D9"/>
+          </w:tcPr>
+          <w:bookmarkEnd w:id="2"/>
+          <w:p>
+            <w:pPr>
+              <w:jc w:val="center"/>
+            </w:pPr>
+            <w:r>
+              <w:rPr>
+                <w:rFonts w:ascii="Arial Narrow" w:hAnsi="Arial Narrow"/>
+                <w:b/>
+                <w:bCs/>
+                <w:color w:val="000000"/>
+                <w:sz w:val="22"/>
+                <w:szCs w:val="22"/>
+              </w:rPr>
+              <w:t>Recepción</w:t>
+            </w:r>
+          </w:p>
+          <w:p>
+            <w:pPr>
+              <w:jc w:val="center"/>
+              <w:rPr>
+                <w:rFonts w:ascii="Arial Narrow" w:hAnsi="Arial Narrow" w:cs="Arial"/>
+                <w:b/>
+                <w:bCs/>
+                <w:sz w:val="22"/>
+                <w:szCs w:val="22"/>
+              </w:rPr>
+            </w:pPr>
+            <w:r>
+              <w:rPr>
+                <w:rFonts w:ascii="Arial Narrow" w:hAnsi="Arial Narrow"/>
+                <w:b/>
+                <w:bCs/>
+                <w:color w:val="000000"/>
+                <w:sz w:val="22"/>
+                <w:szCs w:val="22"/>
+              </w:rPr>
+              <w:t>(Dirección de Infraestructura)</w:t>
+            </w:r>
+          </w:p>
+        </w:tc>
+      </w:tr>
+      <w:tr>
+        <w:trPr>
+          <w:trHeight w:val="1563"/>
+        </w:trPr>
+        <w:tc>
+          <w:tcPr>
+            <w:tcW w:w="3189" w:type="dxa"/>
+            <w:tcBorders>
+              <w:top w:val="single" w:sz="12" w:space="0" w:color="auto"/>
+              <w:left w:val="single" w:sz="12" w:space="0" w:color="auto"/>
+              <w:bottom w:val="single" w:sz="12" w:space="0" w:color="auto"/>
+              <w:right w:val="single" w:sz="12" w:space="0" w:color="auto"/>
+            </w:tcBorders>
+            <w:vAlign w:val="center"/>
+          </w:tcPr>
+          <w:p>
+            <w:pPr>
+              <w:ind w:left="88"/>
+              <w:jc w:val="center"/>
+              <w:rPr>
+                <w:rFonts w:ascii="Arial Narrow" w:hAnsi="Arial Narrow" w:cs="Arial"/>
+                <w:sz w:val="22"/>
+                <w:szCs w:val="22"/>
+              </w:rPr>
+            </w:pPr>
+          </w:p>
+        </w:tc>
+      </w:tr>
+      <w:tr>
+        <w:trPr>
+          <w:trHeight w:val="280"/>
+        </w:trPr>
+        <w:tc>
+          <w:tcPr>
+            <w:tcW w:w="3189" w:type="dxa"/>
+            <w:tcBorders>
+              <w:top w:val="single" w:sz="12" w:space="0" w:color="auto"/>
+              <w:left w:val="single" w:sz="12" w:space="0" w:color="auto"/>
+              <w:bottom w:val="single" w:sz="12" w:space="0" w:color="auto"/>
+              <w:right w:val="single" w:sz="12" w:space="0" w:color="auto"/>
+            </w:tcBorders>
+          </w:tcPr>
+          <w:p>
+            <w:pPr>
+              <w:ind w:left="88"/>
+              <w:rPr>
+                <w:rFonts w:ascii="Arial Narrow" w:hAnsi="Arial Narrow" w:cs="Arial"/>
+                <w:sz w:val="22"/>
+                <w:szCs w:val="22"/>
+              </w:rPr>
+            </w:pPr>
+            <w:r>
+              <w:rPr>
+                <w:rFonts w:ascii="Arial Narrow" w:hAnsi="Arial Narrow"/>
+                <w:sz w:val="22"/>
+                <w:szCs w:val="22"/>
+              </w:rPr>
+              <w:t>Nombre: {{</w:t>
+            </w:r>
+            <w:proofErr w:type="spellStart"/>
+            <w:r>
+              <w:rPr>
+                <w:rFonts w:ascii="Arial Narrow" w:hAnsi="Arial Narrow"/>
+                <w:sz w:val="22"/>
+                <w:szCs w:val="22"/>
+              </w:rPr>
+              <w:t>recibido_por</w:t>
+            </w:r>
+            <w:proofErr w:type="spellEnd"/>
+            <w:r>
+              <w:rPr>
+                <w:rFonts w:ascii="Arial Narrow" w:hAnsi="Arial Narrow"/>
+                <w:sz w:val="22"/>
+                <w:szCs w:val="22"/>
+              </w:rPr>
+              <w:t>}}</w:t>
+            </w:r>
+          </w:p>
+        </w:tc>
+      </w:tr>
+      <w:tr>
+        <w:trPr>
+          <w:trHeight w:val="240"/>
+        </w:trPr>
+        <w:tc>
+          <w:tcPr>
+            <w:tcW w:w="3189" w:type="dxa"/>
+            <w:tcBorders>
+              <w:top w:val="single" w:sz="12" w:space="0" w:color="auto"/>
+              <w:left w:val="single" w:sz="12" w:space="0" w:color="auto"/>
+              <w:bottom w:val="single" w:sz="12" w:space="0" w:color="auto"/>
+              <w:right w:val="single" w:sz="12" w:space="0" w:color="auto"/>
+            </w:tcBorders>
+          </w:tcPr>
+          <w:p>
+            <w:pPr>
+              <w:ind w:left="88"/>
+              <w:rPr>
+                <w:rFonts w:ascii="Arial Narrow" w:hAnsi="Arial Narrow" w:cs="Arial"/>
+                <w:sz w:val="22"/>
+                <w:szCs w:val="22"/>
+              </w:rPr>
+            </w:pPr>
+            <w:proofErr w:type="gramStart"/>
+            <w:r>
+              <w:rPr>
+                <w:rFonts w:ascii="Arial Narrow" w:hAnsi="Arial Narrow"/>
+                <w:sz w:val="22"/>
+                <w:szCs w:val="22"/>
+              </w:rPr>
+              <w:t>Cargo:{</w:t>
+            </w:r>
+            <w:proofErr w:type="gramEnd"/>
+            <w:r>
+              <w:rPr>
+                <w:rFonts w:ascii="Arial Narrow" w:hAnsi="Arial Narrow"/>
+                <w:sz w:val="22"/>
+                <w:szCs w:val="22"/>
+              </w:rPr>
+              <w:t>{</w:t>
+            </w:r>
+            <w:proofErr w:type="spellStart"/>
+            <w:r>
+              <w:rPr>
+                <w:rFonts w:ascii="Arial Narrow" w:hAnsi="Arial Narrow"/>
+                <w:sz w:val="22"/>
+                <w:szCs w:val="22"/>
+              </w:rPr>
+              <w:t>cargo_recibe</w:t>
+            </w:r>
+            <w:proofErr w:type="spellEnd"/>
+            <w:r>
+              <w:rPr>
+                <w:rFonts w:ascii="Arial Narrow" w:hAnsi="Arial Narrow"/>
+                <w:sz w:val="22"/>
+                <w:szCs w:val="22"/>
+              </w:rPr>
+              <w:t>}}</w:t>
+            </w:r>
+          </w:p>
+        </w:tc>
+      </w:tr>
     </w:tbl>
     <w:p>
       <w:pPr>

</xml_diff>

<commit_message>
Stable 3.2 Java "Correcion de Actas"
</commit_message>
<xml_diff>
--- a/backend/src/main/resources/plantillas/ActaDevolucion.docx
+++ b/backend/src/main/resources/plantillas/ActaDevolucion.docx
@@ -62,7 +62,7 @@
                 <v:shape id="_x0000_i1025" type="#_x0000_t75" style="width:114.6pt;height:33pt" o:ole="">
                   <v:imagedata r:id="rId11" o:title=""/>
                 </v:shape>
-                <o:OLEObject Type="Embed" ProgID="PBrush" ShapeID="_x0000_i1025" DrawAspect="Content" ObjectID="_1847251292" r:id="rId12"/>
+                <o:OLEObject Type="Embed" ProgID="PBrush" ShapeID="_x0000_i1025" DrawAspect="Content" ObjectID="_1847261369" r:id="rId12"/>
               </w:object>
             </w:r>
           </w:p>
@@ -2898,7 +2898,7 @@
         <w:tblLook w:val="0000" w:firstRow="0" w:lastRow="0" w:firstColumn="0" w:lastColumn="0" w:noHBand="0" w:noVBand="0"/>
       </w:tblPr>
       <w:tblGrid>
-        <w:gridCol w:w="3189"/>
+        <w:gridCol w:w="4181"/>
       </w:tblGrid>
       <w:tr>
         <w:trPr>
@@ -2906,7 +2906,7 @@
         </w:trPr>
         <w:tc>
           <w:tcPr>
-            <w:tcW w:w="3189" w:type="dxa"/>
+            <w:tcW w:w="4181" w:type="dxa"/>
             <w:tcBorders>
               <w:top w:val="single" w:sz="12" w:space="0" w:color="auto"/>
               <w:left w:val="single" w:sz="12" w:space="0" w:color="auto"/>
@@ -2947,7 +2947,7 @@
         </w:trPr>
         <w:tc>
           <w:tcPr>
-            <w:tcW w:w="3189" w:type="dxa"/>
+            <w:tcW w:w="4181" w:type="dxa"/>
             <w:tcBorders>
               <w:top w:val="single" w:sz="12" w:space="0" w:color="auto"/>
               <w:left w:val="single" w:sz="12" w:space="0" w:color="auto"/>
@@ -2975,7 +2975,7 @@
         </w:trPr>
         <w:tc>
           <w:tcPr>
-            <w:tcW w:w="3189" w:type="dxa"/>
+            <w:tcW w:w="4181" w:type="dxa"/>
             <w:tcBorders>
               <w:top w:val="single" w:sz="12" w:space="0" w:color="auto"/>
               <w:left w:val="single" w:sz="12" w:space="0" w:color="auto"/>
@@ -2987,7 +2987,7 @@
             <w:pPr>
               <w:ind w:left="88"/>
               <w:rPr>
-                <w:rFonts w:ascii="Arial Narrow" w:hAnsi="Arial Narrow" w:cs="Arial"/>
+                <w:rFonts w:ascii="Arial Narrow" w:hAnsi="Arial Narrow"/>
                 <w:sz w:val="22"/>
                 <w:szCs w:val="22"/>
               </w:rPr>
@@ -2998,16 +2998,7 @@
                 <w:sz w:val="22"/>
                 <w:szCs w:val="22"/>
               </w:rPr>
-              <w:t xml:space="preserve">Recibido </w:t>
-            </w:r>
-            <w:proofErr w:type="gramStart"/>
-            <w:r>
-              <w:rPr>
-                <w:rFonts w:ascii="Arial Narrow" w:hAnsi="Arial Narrow" w:cs="Arial"/>
-                <w:sz w:val="22"/>
-                <w:szCs w:val="22"/>
-              </w:rPr>
-              <w:t>por</w:t>
+              <w:t>Recibido por</w:t>
             </w:r>
             <w:r>
               <w:rPr>
@@ -3015,16 +3006,23 @@
                 <w:sz w:val="22"/>
                 <w:szCs w:val="22"/>
               </w:rPr>
-              <w:t>:{</w:t>
-            </w:r>
-            <w:proofErr w:type="gramEnd"/>
+              <w:t>:</w:t>
+            </w:r>
             <w:r>
               <w:rPr>
                 <w:rFonts w:ascii="Arial Narrow" w:hAnsi="Arial Narrow"/>
                 <w:sz w:val="22"/>
                 <w:szCs w:val="22"/>
               </w:rPr>
-              <w:t>{</w:t>
+              <w:t xml:space="preserve"> </w:t>
+            </w:r>
+            <w:r>
+              <w:rPr>
+                <w:rFonts w:ascii="Arial Narrow" w:hAnsi="Arial Narrow"/>
+                <w:sz w:val="22"/>
+                <w:szCs w:val="22"/>
+              </w:rPr>
+              <w:t>{{</w:t>
             </w:r>
             <w:proofErr w:type="spellStart"/>
             <w:r>
@@ -3053,7 +3051,7 @@
         </w:trPr>
         <w:tc>
           <w:tcPr>
-            <w:tcW w:w="3189" w:type="dxa"/>
+            <w:tcW w:w="4181" w:type="dxa"/>
             <w:tcBorders>
               <w:top w:val="single" w:sz="12" w:space="0" w:color="auto"/>
               <w:left w:val="single" w:sz="12" w:space="0" w:color="auto"/>
@@ -3066,8 +3064,10 @@
               <w:ind w:left="88"/>
               <w:rPr>
                 <w:rFonts w:ascii="Arial Narrow" w:hAnsi="Arial Narrow" w:cs="Arial"/>
-                <w:sz w:val="22"/>
-                <w:szCs w:val="22"/>
+                <w:bCs/>
+                <w:sz w:val="22"/>
+                <w:szCs w:val="22"/>
+                <w:lang w:val="es-CO"/>
               </w:rPr>
             </w:pPr>
             <w:r>
@@ -3133,7 +3133,7 @@
         <w:tblLook w:val="0000" w:firstRow="0" w:lastRow="0" w:firstColumn="0" w:lastColumn="0" w:noHBand="0" w:noVBand="0"/>
       </w:tblPr>
       <w:tblGrid>
-        <w:gridCol w:w="3189"/>
+        <w:gridCol w:w="4039"/>
       </w:tblGrid>
       <w:tr>
         <w:trPr>
@@ -3141,7 +3141,7 @@
         </w:trPr>
         <w:tc>
           <w:tcPr>
-            <w:tcW w:w="3189" w:type="dxa"/>
+            <w:tcW w:w="4039" w:type="dxa"/>
             <w:tcBorders>
               <w:top w:val="single" w:sz="12" w:space="0" w:color="auto"/>
               <w:left w:val="single" w:sz="12" w:space="0" w:color="auto"/>
@@ -3198,7 +3198,7 @@
         </w:trPr>
         <w:tc>
           <w:tcPr>
-            <w:tcW w:w="3189" w:type="dxa"/>
+            <w:tcW w:w="4039" w:type="dxa"/>
             <w:tcBorders>
               <w:top w:val="single" w:sz="12" w:space="0" w:color="auto"/>
               <w:left w:val="single" w:sz="12" w:space="0" w:color="auto"/>
@@ -3226,7 +3226,7 @@
         </w:trPr>
         <w:tc>
           <w:tcPr>
-            <w:tcW w:w="3189" w:type="dxa"/>
+            <w:tcW w:w="4039" w:type="dxa"/>
             <w:tcBorders>
               <w:top w:val="single" w:sz="12" w:space="0" w:color="auto"/>
               <w:left w:val="single" w:sz="12" w:space="0" w:color="auto"/>
@@ -3238,7 +3238,7 @@
             <w:pPr>
               <w:ind w:left="88"/>
               <w:rPr>
-                <w:rFonts w:ascii="Arial Narrow" w:hAnsi="Arial Narrow" w:cs="Arial"/>
+                <w:rFonts w:ascii="Arial Narrow" w:hAnsi="Arial Narrow"/>
                 <w:sz w:val="22"/>
                 <w:szCs w:val="22"/>
               </w:rPr>
@@ -3278,7 +3278,7 @@
         </w:trPr>
         <w:tc>
           <w:tcPr>
-            <w:tcW w:w="3189" w:type="dxa"/>
+            <w:tcW w:w="4039" w:type="dxa"/>
             <w:tcBorders>
               <w:top w:val="single" w:sz="12" w:space="0" w:color="auto"/>
               <w:left w:val="single" w:sz="12" w:space="0" w:color="auto"/>
@@ -3290,28 +3290,34 @@
             <w:pPr>
               <w:ind w:left="88"/>
               <w:rPr>
-                <w:rFonts w:ascii="Arial Narrow" w:hAnsi="Arial Narrow" w:cs="Arial"/>
+                <w:rFonts w:ascii="Arial Narrow" w:hAnsi="Arial Narrow"/>
                 <w:sz w:val="22"/>
                 <w:szCs w:val="22"/>
               </w:rPr>
             </w:pPr>
-            <w:proofErr w:type="gramStart"/>
             <w:r>
               <w:rPr>
                 <w:rFonts w:ascii="Arial Narrow" w:hAnsi="Arial Narrow"/>
                 <w:sz w:val="22"/>
                 <w:szCs w:val="22"/>
               </w:rPr>
-              <w:t>Cargo:{</w:t>
-            </w:r>
-            <w:proofErr w:type="gramEnd"/>
+              <w:t>Cargo:</w:t>
+            </w:r>
             <w:r>
               <w:rPr>
                 <w:rFonts w:ascii="Arial Narrow" w:hAnsi="Arial Narrow"/>
                 <w:sz w:val="22"/>
                 <w:szCs w:val="22"/>
               </w:rPr>
-              <w:t>{</w:t>
+              <w:t xml:space="preserve"> </w:t>
+            </w:r>
+            <w:r>
+              <w:rPr>
+                <w:rFonts w:ascii="Arial Narrow" w:hAnsi="Arial Narrow"/>
+                <w:sz w:val="22"/>
+                <w:szCs w:val="22"/>
+              </w:rPr>
+              <w:t>{{</w:t>
             </w:r>
             <w:proofErr w:type="spellStart"/>
             <w:r>
@@ -3346,78 +3352,7 @@
     </w:p>
     <w:p>
       <w:pPr>
-        <w:rPr>
-          <w:rFonts w:ascii="Arial Narrow" w:hAnsi="Arial Narrow" w:cs="Arial"/>
-          <w:sz w:val="22"/>
-          <w:szCs w:val="22"/>
-        </w:rPr>
-      </w:pPr>
-    </w:p>
-    <w:p>
-      <w:pPr>
-        <w:rPr>
-          <w:rFonts w:ascii="Arial Narrow" w:hAnsi="Arial Narrow" w:cs="Arial"/>
-          <w:sz w:val="22"/>
-          <w:szCs w:val="22"/>
-        </w:rPr>
-      </w:pPr>
-    </w:p>
-    <w:p>
-      <w:pPr>
-        <w:rPr>
-          <w:rFonts w:ascii="Arial Narrow" w:hAnsi="Arial Narrow" w:cs="Arial"/>
-          <w:sz w:val="22"/>
-          <w:szCs w:val="22"/>
-        </w:rPr>
-      </w:pPr>
-    </w:p>
-    <w:p>
-      <w:pPr>
-        <w:rPr>
-          <w:rFonts w:ascii="Arial Narrow" w:hAnsi="Arial Narrow" w:cs="Arial"/>
-          <w:sz w:val="22"/>
-          <w:szCs w:val="22"/>
-        </w:rPr>
-      </w:pPr>
-    </w:p>
-    <w:p>
-      <w:pPr>
-        <w:rPr>
-          <w:rFonts w:ascii="Arial Narrow" w:hAnsi="Arial Narrow" w:cs="Arial"/>
-          <w:sz w:val="22"/>
-          <w:szCs w:val="22"/>
-        </w:rPr>
-      </w:pPr>
-    </w:p>
-    <w:p>
-      <w:pPr>
-        <w:rPr>
-          <w:rFonts w:ascii="Arial Narrow" w:hAnsi="Arial Narrow" w:cs="Arial"/>
-          <w:sz w:val="22"/>
-          <w:szCs w:val="22"/>
-        </w:rPr>
-      </w:pPr>
-    </w:p>
-    <w:p>
-      <w:pPr>
-        <w:rPr>
-          <w:rFonts w:ascii="Arial Narrow" w:hAnsi="Arial Narrow" w:cs="Arial"/>
-          <w:sz w:val="22"/>
-          <w:szCs w:val="22"/>
-        </w:rPr>
-      </w:pPr>
-    </w:p>
-    <w:p>
-      <w:pPr>
-        <w:rPr>
-          <w:rFonts w:ascii="Arial Narrow" w:hAnsi="Arial Narrow" w:cs="Arial"/>
-          <w:sz w:val="22"/>
-          <w:szCs w:val="22"/>
-        </w:rPr>
-      </w:pPr>
-    </w:p>
-    <w:p>
-      <w:pPr>
+        <w:ind w:left="4140"/>
         <w:jc w:val="center"/>
         <w:rPr>
           <w:rFonts w:ascii="Arial Narrow" w:hAnsi="Arial Narrow" w:cs="Arial"/>
@@ -10025,9 +9960,7 @@
 </file>
 
 <file path=customXml/item1.xml><?xml version="1.0" encoding="utf-8"?>
-<p:properties xmlns:p="http://schemas.microsoft.com/office/2006/metadata/properties" xmlns:xsi="http://www.w3.org/2001/XMLSchema-instance" xmlns:pc="http://schemas.microsoft.com/office/infopath/2007/PartnerControls">
-  <documentManagement/>
-</p:properties>
+<b:Sources xmlns:b="http://schemas.openxmlformats.org/officeDocument/2006/bibliography" xmlns="http://schemas.openxmlformats.org/officeDocument/2006/bibliography" SelectedStyle="\APA.XSL" StyleName="APA"/>
 </file>
 
 <file path=customXml/item2.xml><?xml version="1.0" encoding="utf-8"?>
@@ -10040,7 +9973,9 @@
 </file>
 
 <file path=customXml/item3.xml><?xml version="1.0" encoding="utf-8"?>
-<b:Sources xmlns:b="http://schemas.openxmlformats.org/officeDocument/2006/bibliography" xmlns="http://schemas.openxmlformats.org/officeDocument/2006/bibliography" SelectedStyle="\APA.XSL" StyleName="APA"/>
+<p:properties xmlns:p="http://schemas.microsoft.com/office/2006/metadata/properties" xmlns:xsi="http://www.w3.org/2001/XMLSchema-instance" xmlns:pc="http://schemas.microsoft.com/office/infopath/2007/PartnerControls">
+  <documentManagement/>
+</p:properties>
 </file>
 
 <file path=customXml/item4.xml><?xml version="1.0" encoding="utf-8"?>
@@ -10158,10 +10093,9 @@
 </file>
 
 <file path=customXml/itemProps1.xml><?xml version="1.0" encoding="utf-8"?>
-<ds:datastoreItem xmlns:ds="http://schemas.openxmlformats.org/officeDocument/2006/customXml" ds:itemID="{EF3E0972-8A18-4F26-9B4E-0E79A737726A}">
+<ds:datastoreItem xmlns:ds="http://schemas.openxmlformats.org/officeDocument/2006/customXml" ds:itemID="{519B9EBB-F359-4FB9-B6D7-A5A5629DEF06}">
   <ds:schemaRefs>
-    <ds:schemaRef ds:uri="http://schemas.microsoft.com/office/2006/metadata/properties"/>
-    <ds:schemaRef ds:uri="http://schemas.microsoft.com/office/infopath/2007/PartnerControls"/>
+    <ds:schemaRef ds:uri="http://schemas.openxmlformats.org/officeDocument/2006/bibliography"/>
   </ds:schemaRefs>
 </ds:datastoreItem>
 </file>
@@ -10175,9 +10109,10 @@
 </file>
 
 <file path=customXml/itemProps3.xml><?xml version="1.0" encoding="utf-8"?>
-<ds:datastoreItem xmlns:ds="http://schemas.openxmlformats.org/officeDocument/2006/customXml" ds:itemID="{519B9EBB-F359-4FB9-B6D7-A5A5629DEF06}">
+<ds:datastoreItem xmlns:ds="http://schemas.openxmlformats.org/officeDocument/2006/customXml" ds:itemID="{EF3E0972-8A18-4F26-9B4E-0E79A737726A}">
   <ds:schemaRefs>
-    <ds:schemaRef ds:uri="http://schemas.openxmlformats.org/officeDocument/2006/bibliography"/>
+    <ds:schemaRef ds:uri="http://schemas.microsoft.com/office/2006/metadata/properties"/>
+    <ds:schemaRef ds:uri="http://schemas.microsoft.com/office/infopath/2007/PartnerControls"/>
   </ds:schemaRefs>
 </ds:datastoreItem>
 </file>

</xml_diff>